<commit_message>
Auto-save: 15 file(s) — 2026-08-25 15:05
</commit_message>
<xml_diff>
--- a/Projects/NEPRA Follow-Up Letters/01_Finergy.docx
+++ b/Projects/NEPRA Follow-Up Letters/01_Finergy.docx
@@ -88,18 +88,7 @@
           <w:sz w:val="19"/>
           <w:szCs w:val="19"/>
         </w:rPr>
-        <w:t xml:space="preserve">Subject: Follow-Up: NEPRA IT/OT Security Compliance Support for </w:t>
-      </w:r>
-      <w:r>
-        <w:rPr>
-          <w:rFonts w:ascii="Poppins" w:eastAsia="Calibri" w:hAnsi="Poppins" w:cs="Poppins"/>
-          <w:b/>
-          <w:bCs/>
-          <w:color w:val="0B2545"/>
-          <w:sz w:val="19"/>
-          <w:szCs w:val="19"/>
-        </w:rPr>
-        <w:t>Finergy</w:t>
+        <w:t>Subject: Follow up: NEPRA (Security of Information Technology and Operational Technology) Regulations, 2022 — Compliance Advisory &amp; Support Services</w:t>
       </w:r>
     </w:p>
     <w:p>
@@ -157,7 +146,23 @@
           <w:sz w:val="19"/>
           <w:szCs w:val="19"/>
         </w:rPr>
-        <w:t xml:space="preserve">I’m following up on our earlier note regarding NEPRA’s Security of IT and OT Regulations, 2022. As specialists in NEPRA compliance, we’d welcome the opportunity to support </w:t>
+        <w:t xml:space="preserve">I’m following up on </w:t>
+      </w:r>
+      <w:r>
+        <w:rPr>
+          <w:rFonts w:ascii="Poppins" w:hAnsi="Poppins" w:cs="Poppins"/>
+          <w:sz w:val="19"/>
+          <w:szCs w:val="19"/>
+        </w:rPr>
+        <w:t>our earlier letter regarding</w:t>
+      </w:r>
+      <w:r>
+        <w:rPr>
+          <w:rFonts w:ascii="Poppins" w:hAnsi="Poppins" w:cs="Poppins"/>
+          <w:sz w:val="19"/>
+          <w:szCs w:val="19"/>
+        </w:rPr>
+        <w:t xml:space="preserve"> NEPRA’s Security of IT and OT Regulations, 2022. As specialists in NEPRA compliance, we’d welcome the opportunity to support </w:t>
       </w:r>
       <w:r>
         <w:rPr>
@@ -359,7 +364,25 @@
           <w:sz w:val="19"/>
           <w:szCs w:val="19"/>
         </w:rPr>
-        <w:t>We’d welcome a brief call to walk your team through a tailored compliance roadmap, starting with a complimentary gap assessment. Reach out at your convenience, or learn more at www.xloopdigital.com/services/cyber-security-service.</w:t>
+        <w:t xml:space="preserve">We’d welcome a brief call to walk your team through a tailored compliance roadmap, starting with a complimentary gap assessment. Reach out at your convenience, or learn more </w:t>
+      </w:r>
+      <w:r>
+        <w:rPr>
+          <w:rFonts w:ascii="Poppins" w:eastAsia="Calibri" w:hAnsi="Poppins" w:cs="Poppins"/>
+          <w:color w:val="3A3A3A"/>
+          <w:sz w:val="19"/>
+          <w:szCs w:val="19"/>
+        </w:rPr>
+        <w:t>at https://www.xloopdigital.com/services/cyber-security-service</w:t>
+      </w:r>
+      <w:r>
+        <w:rPr>
+          <w:rFonts w:ascii="Poppins" w:eastAsia="Calibri" w:hAnsi="Poppins" w:cs="Poppins"/>
+          <w:color w:val="3A3A3A"/>
+          <w:sz w:val="19"/>
+          <w:szCs w:val="19"/>
+        </w:rPr>
+        <w:t>.</w:t>
       </w:r>
     </w:p>
     <w:p>

</xml_diff>

<commit_message>
Auto-save: 8 file(s) — 2026-08-25 15:27
</commit_message>
<xml_diff>
--- a/Projects/NEPRA Follow-Up Letters/01_Finergy.docx
+++ b/Projects/NEPRA Follow-Up Letters/01_Finergy.docx
@@ -94,7 +94,6 @@
     <w:p>
       <w:pPr>
         <w:spacing w:after="130" w:line="276" w:lineRule="auto"/>
-        <w:jc w:val="both"/>
         <w:rPr>
           <w:rFonts w:ascii="Poppins" w:eastAsia="Calibri" w:hAnsi="Poppins" w:cs="Poppins"/>
           <w:color w:val="3A3A3A"/>
@@ -133,7 +132,6 @@
     <w:p>
       <w:pPr>
         <w:spacing w:after="130" w:line="276" w:lineRule="auto"/>
-        <w:jc w:val="both"/>
         <w:rPr>
           <w:rFonts w:ascii="Poppins" w:hAnsi="Poppins" w:cs="Poppins"/>
           <w:sz w:val="19"/>
@@ -350,7 +348,6 @@
     <w:p>
       <w:pPr>
         <w:spacing w:after="130" w:line="276" w:lineRule="auto"/>
-        <w:jc w:val="both"/>
         <w:rPr>
           <w:rFonts w:ascii="Poppins" w:hAnsi="Poppins" w:cs="Poppins"/>
           <w:sz w:val="19"/>
@@ -373,22 +370,32 @@
           <w:sz w:val="19"/>
           <w:szCs w:val="19"/>
         </w:rPr>
-        <w:t>at https://www.xloopdigital.com/services/cyber-security-service</w:t>
-      </w:r>
-      <w:r>
-        <w:rPr>
-          <w:rFonts w:ascii="Poppins" w:eastAsia="Calibri" w:hAnsi="Poppins" w:cs="Poppins"/>
-          <w:color w:val="3A3A3A"/>
-          <w:sz w:val="19"/>
-          <w:szCs w:val="19"/>
-        </w:rPr>
-        <w:t>.</w:t>
+        <w:t xml:space="preserve">at </w:t>
+      </w:r>
+      <w:hyperlink r:id="rId7" w:history="1">
+        <w:r>
+          <w:rPr>
+            <w:rStyle w:val="Hyperlink"/>
+            <w:rFonts w:ascii="Poppins" w:eastAsia="Calibri" w:hAnsi="Poppins" w:cs="Poppins"/>
+            <w:sz w:val="19"/>
+            <w:szCs w:val="19"/>
+          </w:rPr>
+          <w:t>https://www.xloopdigital.com/services/cyber-security-service</w:t>
+        </w:r>
+      </w:hyperlink>
+      <w:r>
+        <w:rPr>
+          <w:rFonts w:ascii="Poppins" w:eastAsia="Calibri" w:hAnsi="Poppins" w:cs="Poppins"/>
+          <w:color w:val="3A3A3A"/>
+          <w:sz w:val="19"/>
+          <w:szCs w:val="19"/>
+        </w:rPr>
+        <w:t xml:space="preserve"> </w:t>
       </w:r>
     </w:p>
     <w:p>
       <w:pPr>
         <w:spacing w:after="130" w:line="276" w:lineRule="auto"/>
-        <w:jc w:val="both"/>
         <w:rPr>
           <w:rFonts w:ascii="Poppins" w:eastAsia="Calibri" w:hAnsi="Poppins" w:cs="Poppins"/>
           <w:color w:val="3A3A3A"/>
@@ -427,7 +434,6 @@
     <w:p>
       <w:pPr>
         <w:spacing w:after="130" w:line="276" w:lineRule="auto"/>
-        <w:jc w:val="both"/>
         <w:rPr>
           <w:rFonts w:ascii="Poppins" w:hAnsi="Poppins" w:cs="Poppins"/>
           <w:sz w:val="19"/>
@@ -659,8 +665,8 @@
       </w:pPr>
     </w:p>
     <w:sectPr>
-      <w:headerReference w:type="default" r:id="rId7"/>
-      <w:footerReference w:type="default" r:id="rId8"/>
+      <w:headerReference w:type="default" r:id="rId8"/>
+      <w:footerReference w:type="default" r:id="rId9"/>
       <w:pgSz w:w="12240" w:h="15840"/>
       <w:pgMar w:top="2160" w:right="1100" w:bottom="900" w:left="1100" w:header="708" w:footer="708" w:gutter="0"/>
       <w:cols w:space="720"/>
@@ -1783,6 +1789,18 @@
     <w:uiPriority w:val="99"/>
     <w:rsid w:val="00D51F52"/>
   </w:style>
+  <w:style w:type="character" w:styleId="UnresolvedMention">
+    <w:name w:val="Unresolved Mention"/>
+    <w:basedOn w:val="DefaultParagraphFont"/>
+    <w:uiPriority w:val="99"/>
+    <w:semiHidden/>
+    <w:unhideWhenUsed/>
+    <w:rsid w:val="00F075EC"/>
+    <w:rPr>
+      <w:color w:val="605E5C"/>
+      <w:shd w:val="clear" w:color="auto" w:fill="E1DFDD"/>
+    </w:rPr>
+  </w:style>
 </w:styles>
 </file>
 

</xml_diff>

<commit_message>
Auto-save: 12 file(s) — 2026-08-25 18:19
</commit_message>
<xml_diff>
--- a/Projects/NEPRA Follow-Up Letters/01_Finergy.docx
+++ b/Projects/NEPRA Follow-Up Letters/01_Finergy.docx
@@ -567,6 +567,14 @@
     <w:p>
       <w:pPr>
         <w:rPr>
+          <w:rFonts w:ascii="Poppins" w:hAnsi="Poppins" w:cs="Poppins"/>
+          <w:b/>
+          <w:sz w:val="19"/>
+          <w:szCs w:val="19"/>
+        </w:rPr>
+      </w:pPr>
+      <w:r>
+        <w:rPr>
           <w:rFonts w:ascii="Poppins" w:eastAsia="Calibri" w:hAnsi="Poppins" w:cs="Poppins"/>
           <w:b/>
           <w:bCs/>
@@ -574,26 +582,6 @@
           <w:sz w:val="19"/>
           <w:szCs w:val="19"/>
         </w:rPr>
-      </w:pPr>
-    </w:p>
-    <w:p>
-      <w:pPr>
-        <w:rPr>
-          <w:rFonts w:ascii="Poppins" w:hAnsi="Poppins" w:cs="Poppins"/>
-          <w:b/>
-          <w:sz w:val="19"/>
-          <w:szCs w:val="19"/>
-        </w:rPr>
-      </w:pPr>
-      <w:r>
-        <w:rPr>
-          <w:rFonts w:ascii="Poppins" w:eastAsia="Calibri" w:hAnsi="Poppins" w:cs="Poppins"/>
-          <w:b/>
-          <w:bCs/>
-          <w:color w:val="0B2545"/>
-          <w:sz w:val="19"/>
-          <w:szCs w:val="19"/>
-        </w:rPr>
         <w:t>Huzaifa Valika</w:t>
       </w:r>
     </w:p>
@@ -665,10 +653,14 @@
       </w:pPr>
     </w:p>
     <w:sectPr>
-      <w:headerReference w:type="default" r:id="rId8"/>
-      <w:footerReference w:type="default" r:id="rId9"/>
-      <w:pgSz w:w="12240" w:h="15840"/>
-      <w:pgMar w:top="2160" w:right="1100" w:bottom="900" w:left="1100" w:header="708" w:footer="708" w:gutter="0"/>
+      <w:headerReference w:type="even" r:id="rId8"/>
+      <w:headerReference w:type="default" r:id="rId9"/>
+      <w:footerReference w:type="even" r:id="rId10"/>
+      <w:footerReference w:type="default" r:id="rId11"/>
+      <w:headerReference w:type="first" r:id="rId12"/>
+      <w:footerReference w:type="first" r:id="rId13"/>
+      <w:pgSz w:w="11906" w:h="16838"/>
+      <w:pgMar w:top="2211" w:right="1100" w:bottom="1984" w:left="1100" w:header="0" w:footer="0" w:gutter="0"/>
       <w:cols w:space="720"/>
       <w:docGrid w:linePitch="360"/>
     </w:sectPr>
@@ -699,10 +691,27 @@
 <w:ftr xmlns:wpc="http://schemas.microsoft.com/office/word/2010/wordprocessingCanvas" xmlns:cx="http://schemas.microsoft.com/office/drawing/2014/chartex" xmlns:cx1="http://schemas.microsoft.com/office/drawing/2015/9/8/chartex" xmlns:cx2="http://schemas.microsoft.com/office/drawing/2015/10/21/chartex" xmlns:cx3="http://schemas.microsoft.com/office/drawing/2016/5/9/chartex" xmlns:cx4="http://schemas.microsoft.com/office/drawing/2016/5/10/chartex" xmlns:cx5="http://schemas.microsoft.com/office/drawing/2016/5/11/chartex" xmlns:cx6="http://schemas.microsoft.com/office/drawing/2016/5/12/chartex" xmlns:cx7="http://schemas.microsoft.com/office/drawing/2016/5/13/chartex" xmlns:cx8="http://schemas.microsoft.com/office/drawing/2016/5/14/chartex" xmlns:mc="http://schemas.openxmlformats.org/markup-compatibility/2006" xmlns:aink="http://schemas.microsoft.com/office/drawing/2016/ink" xmlns:am3d="http://schemas.microsoft.com/office/drawing/2017/model3d" xmlns:o="urn:schemas-microsoft-com:office:office" xmlns:r="http://schemas.openxmlformats.org/officeDocument/2006/relationships" xmlns:m="http://schemas.openxmlformats.org/officeDocument/2006/math" xmlns:v="urn:schemas-microsoft-com:vml" xmlns:wp14="http://schemas.microsoft.com/office/word/2010/wordprocessingDrawing" xmlns:wp="http://schemas.openxmlformats.org/drawingml/2006/wordprocessingDrawing" xmlns:w10="urn:schemas-microsoft-com:office:word" xmlns:w="http://schemas.openxmlformats.org/wordprocessingml/2006/main" xmlns:w14="http://schemas.microsoft.com/office/word/2010/wordml" xmlns:w15="http://schemas.microsoft.com/office/word/2012/wordml" xmlns:w16cid="http://schemas.microsoft.com/office/word/2016/wordml/cid" xmlns:w16se="http://schemas.microsoft.com/office/word/2015/wordml/symex" xmlns:wpg="http://schemas.microsoft.com/office/word/2010/wordprocessingGroup" xmlns:wpi="http://schemas.microsoft.com/office/word/2010/wordprocessingInk" xmlns:wne="http://schemas.microsoft.com/office/word/2006/wordml" xmlns:wps="http://schemas.microsoft.com/office/word/2010/wordprocessingShape" mc:Ignorable="w14 w15 w16se w16cid wp14">
   <w:p>
     <w:pPr>
-      <w:pBdr>
-        <w:top w:val="single" w:sz="6" w:space="6" w:color="CCCCCC"/>
-      </w:pBdr>
+      <w:pStyle w:val="Footer"/>
+    </w:pPr>
+  </w:p>
+</w:ftr>
+</file>
+
+<file path=word/footer2.xml><?xml version="1.0" encoding="utf-8"?>
+<w:ftr xmlns:wpc="http://schemas.microsoft.com/office/word/2010/wordprocessingCanvas" xmlns:cx="http://schemas.microsoft.com/office/drawing/2014/chartex" xmlns:cx1="http://schemas.microsoft.com/office/drawing/2015/9/8/chartex" xmlns:cx2="http://schemas.microsoft.com/office/drawing/2015/10/21/chartex" xmlns:cx3="http://schemas.microsoft.com/office/drawing/2016/5/9/chartex" xmlns:cx4="http://schemas.microsoft.com/office/drawing/2016/5/10/chartex" xmlns:cx5="http://schemas.microsoft.com/office/drawing/2016/5/11/chartex" xmlns:cx6="http://schemas.microsoft.com/office/drawing/2016/5/12/chartex" xmlns:cx7="http://schemas.microsoft.com/office/drawing/2016/5/13/chartex" xmlns:cx8="http://schemas.microsoft.com/office/drawing/2016/5/14/chartex" xmlns:mc="http://schemas.openxmlformats.org/markup-compatibility/2006" xmlns:aink="http://schemas.microsoft.com/office/drawing/2016/ink" xmlns:am3d="http://schemas.microsoft.com/office/drawing/2017/model3d" xmlns:o="urn:schemas-microsoft-com:office:office" xmlns:r="http://schemas.openxmlformats.org/officeDocument/2006/relationships" xmlns:m="http://schemas.openxmlformats.org/officeDocument/2006/math" xmlns:v="urn:schemas-microsoft-com:vml" xmlns:wp14="http://schemas.microsoft.com/office/word/2010/wordprocessingDrawing" xmlns:wp="http://schemas.openxmlformats.org/drawingml/2006/wordprocessingDrawing" xmlns:w10="urn:schemas-microsoft-com:office:word" xmlns:w="http://schemas.openxmlformats.org/wordprocessingml/2006/main" xmlns:w14="http://schemas.microsoft.com/office/word/2010/wordml" xmlns:w15="http://schemas.microsoft.com/office/word/2012/wordml" xmlns:w16cid="http://schemas.microsoft.com/office/word/2016/wordml/cid" xmlns:w16se="http://schemas.microsoft.com/office/word/2015/wordml/symex" xmlns:wpg="http://schemas.microsoft.com/office/word/2010/wordprocessingGroup" xmlns:wpi="http://schemas.microsoft.com/office/word/2010/wordprocessingInk" xmlns:wne="http://schemas.microsoft.com/office/word/2006/wordml" xmlns:wps="http://schemas.microsoft.com/office/word/2010/wordprocessingShape" mc:Ignorable="w14 w15 w16se w16cid wp14">
+  <w:p>
+    <w:pPr>
       <w:jc w:val="center"/>
+    </w:pPr>
+  </w:p>
+</w:ftr>
+</file>
+
+<file path=word/footer3.xml><?xml version="1.0" encoding="utf-8"?>
+<w:ftr xmlns:wpc="http://schemas.microsoft.com/office/word/2010/wordprocessingCanvas" xmlns:cx="http://schemas.microsoft.com/office/drawing/2014/chartex" xmlns:cx1="http://schemas.microsoft.com/office/drawing/2015/9/8/chartex" xmlns:cx2="http://schemas.microsoft.com/office/drawing/2015/10/21/chartex" xmlns:cx3="http://schemas.microsoft.com/office/drawing/2016/5/9/chartex" xmlns:cx4="http://schemas.microsoft.com/office/drawing/2016/5/10/chartex" xmlns:cx5="http://schemas.microsoft.com/office/drawing/2016/5/11/chartex" xmlns:cx6="http://schemas.microsoft.com/office/drawing/2016/5/12/chartex" xmlns:cx7="http://schemas.microsoft.com/office/drawing/2016/5/13/chartex" xmlns:cx8="http://schemas.microsoft.com/office/drawing/2016/5/14/chartex" xmlns:mc="http://schemas.openxmlformats.org/markup-compatibility/2006" xmlns:aink="http://schemas.microsoft.com/office/drawing/2016/ink" xmlns:am3d="http://schemas.microsoft.com/office/drawing/2017/model3d" xmlns:o="urn:schemas-microsoft-com:office:office" xmlns:r="http://schemas.openxmlformats.org/officeDocument/2006/relationships" xmlns:m="http://schemas.openxmlformats.org/officeDocument/2006/math" xmlns:v="urn:schemas-microsoft-com:vml" xmlns:wp14="http://schemas.microsoft.com/office/word/2010/wordprocessingDrawing" xmlns:wp="http://schemas.openxmlformats.org/drawingml/2006/wordprocessingDrawing" xmlns:w10="urn:schemas-microsoft-com:office:word" xmlns:w="http://schemas.openxmlformats.org/wordprocessingml/2006/main" xmlns:w14="http://schemas.microsoft.com/office/word/2010/wordml" xmlns:w15="http://schemas.microsoft.com/office/word/2012/wordml" xmlns:w16cid="http://schemas.microsoft.com/office/word/2016/wordml/cid" xmlns:w16se="http://schemas.microsoft.com/office/word/2015/wordml/symex" xmlns:wpg="http://schemas.microsoft.com/office/word/2010/wordprocessingGroup" xmlns:wpi="http://schemas.microsoft.com/office/word/2010/wordprocessingInk" xmlns:wne="http://schemas.microsoft.com/office/word/2006/wordml" xmlns:wps="http://schemas.microsoft.com/office/word/2010/wordprocessingShape" mc:Ignorable="w14 w15 w16se w16cid wp14">
+  <w:p>
+    <w:pPr>
+      <w:pStyle w:val="Footer"/>
     </w:pPr>
   </w:p>
 </w:ftr>
@@ -731,7 +740,87 @@
 <w:hdr xmlns:wpc="http://schemas.microsoft.com/office/word/2010/wordprocessingCanvas" xmlns:cx="http://schemas.microsoft.com/office/drawing/2014/chartex" xmlns:cx1="http://schemas.microsoft.com/office/drawing/2015/9/8/chartex" xmlns:cx2="http://schemas.microsoft.com/office/drawing/2015/10/21/chartex" xmlns:cx3="http://schemas.microsoft.com/office/drawing/2016/5/9/chartex" xmlns:cx4="http://schemas.microsoft.com/office/drawing/2016/5/10/chartex" xmlns:cx5="http://schemas.microsoft.com/office/drawing/2016/5/11/chartex" xmlns:cx6="http://schemas.microsoft.com/office/drawing/2016/5/12/chartex" xmlns:cx7="http://schemas.microsoft.com/office/drawing/2016/5/13/chartex" xmlns:cx8="http://schemas.microsoft.com/office/drawing/2016/5/14/chartex" xmlns:mc="http://schemas.openxmlformats.org/markup-compatibility/2006" xmlns:aink="http://schemas.microsoft.com/office/drawing/2016/ink" xmlns:am3d="http://schemas.microsoft.com/office/drawing/2017/model3d" xmlns:o="urn:schemas-microsoft-com:office:office" xmlns:r="http://schemas.openxmlformats.org/officeDocument/2006/relationships" xmlns:m="http://schemas.openxmlformats.org/officeDocument/2006/math" xmlns:v="urn:schemas-microsoft-com:vml" xmlns:wp14="http://schemas.microsoft.com/office/word/2010/wordprocessingDrawing" xmlns:wp="http://schemas.openxmlformats.org/drawingml/2006/wordprocessingDrawing" xmlns:w10="urn:schemas-microsoft-com:office:word" xmlns:w="http://schemas.openxmlformats.org/wordprocessingml/2006/main" xmlns:w14="http://schemas.microsoft.com/office/word/2010/wordml" xmlns:w15="http://schemas.microsoft.com/office/word/2012/wordml" xmlns:w16cid="http://schemas.microsoft.com/office/word/2016/wordml/cid" xmlns:w16se="http://schemas.microsoft.com/office/word/2015/wordml/symex" xmlns:wpg="http://schemas.microsoft.com/office/word/2010/wordprocessingGroup" xmlns:wpi="http://schemas.microsoft.com/office/word/2010/wordprocessingInk" xmlns:wne="http://schemas.microsoft.com/office/word/2006/wordml" xmlns:wps="http://schemas.microsoft.com/office/word/2010/wordprocessingShape" mc:Ignorable="w14 w15 w16se w16cid wp14">
   <w:p>
     <w:pPr>
+      <w:pStyle w:val="Header"/>
+    </w:pPr>
+  </w:p>
+</w:hdr>
+</file>
+
+<file path=word/header2.xml><?xml version="1.0" encoding="utf-8"?>
+<w:hdr xmlns:wpc="http://schemas.microsoft.com/office/word/2010/wordprocessingCanvas" xmlns:cx="http://schemas.microsoft.com/office/drawing/2014/chartex" xmlns:cx1="http://schemas.microsoft.com/office/drawing/2015/9/8/chartex" xmlns:cx2="http://schemas.microsoft.com/office/drawing/2015/10/21/chartex" xmlns:cx3="http://schemas.microsoft.com/office/drawing/2016/5/9/chartex" xmlns:cx4="http://schemas.microsoft.com/office/drawing/2016/5/10/chartex" xmlns:cx5="http://schemas.microsoft.com/office/drawing/2016/5/11/chartex" xmlns:cx6="http://schemas.microsoft.com/office/drawing/2016/5/12/chartex" xmlns:cx7="http://schemas.microsoft.com/office/drawing/2016/5/13/chartex" xmlns:cx8="http://schemas.microsoft.com/office/drawing/2016/5/14/chartex" xmlns:mc="http://schemas.openxmlformats.org/markup-compatibility/2006" xmlns:aink="http://schemas.microsoft.com/office/drawing/2016/ink" xmlns:am3d="http://schemas.microsoft.com/office/drawing/2017/model3d" xmlns:o="urn:schemas-microsoft-com:office:office" xmlns:r="http://schemas.openxmlformats.org/officeDocument/2006/relationships" xmlns:m="http://schemas.openxmlformats.org/officeDocument/2006/math" xmlns:v="urn:schemas-microsoft-com:vml" xmlns:wp14="http://schemas.microsoft.com/office/word/2010/wordprocessingDrawing" xmlns:wp="http://schemas.openxmlformats.org/drawingml/2006/wordprocessingDrawing" xmlns:w10="urn:schemas-microsoft-com:office:word" xmlns:w="http://schemas.openxmlformats.org/wordprocessingml/2006/main" xmlns:w14="http://schemas.microsoft.com/office/word/2010/wordml" xmlns:w15="http://schemas.microsoft.com/office/word/2012/wordml" xmlns:w16cid="http://schemas.microsoft.com/office/word/2016/wordml/cid" xmlns:w16se="http://schemas.microsoft.com/office/word/2015/wordml/symex" xmlns:wpg="http://schemas.microsoft.com/office/word/2010/wordprocessingGroup" xmlns:wpi="http://schemas.microsoft.com/office/word/2010/wordprocessingInk" xmlns:wne="http://schemas.microsoft.com/office/word/2006/wordml" xmlns:wps="http://schemas.microsoft.com/office/word/2010/wordprocessingShape" mc:Ignorable="w14 w15 w16se w16cid wp14">
+  <w:p>
+    <w:pPr>
       <w:spacing w:after="200"/>
+    </w:pPr>
+    <w:r>
+      <w:rPr>
+        <w:noProof/>
+      </w:rPr>
+      <w:drawing>
+        <wp:anchor distT="0" distB="0" distL="114300" distR="114300" simplePos="0" relativeHeight="251658240" behindDoc="1" locked="0" layoutInCell="1" allowOverlap="1" wp14:anchorId="3977FDFC" wp14:editId="7362DA2E">
+          <wp:simplePos x="0" y="0"/>
+          <wp:positionH relativeFrom="page">
+            <wp:posOffset>0</wp:posOffset>
+          </wp:positionH>
+          <wp:positionV relativeFrom="page">
+            <wp:posOffset>0</wp:posOffset>
+          </wp:positionV>
+          <wp:extent cx="7560000" cy="10692000"/>
+          <wp:effectExtent l="0" t="0" r="3175" b="0"/>
+          <wp:wrapNone/>
+          <wp:docPr id="2" name="LetterheadArt"/>
+          <wp:cNvGraphicFramePr>
+            <a:graphicFrameLocks xmlns:a="http://schemas.openxmlformats.org/drawingml/2006/main"/>
+          </wp:cNvGraphicFramePr>
+          <a:graphic xmlns:a="http://schemas.openxmlformats.org/drawingml/2006/main">
+            <a:graphicData uri="http://schemas.openxmlformats.org/drawingml/2006/picture">
+              <pic:pic xmlns:pic="http://schemas.openxmlformats.org/drawingml/2006/picture">
+                <pic:nvPicPr>
+                  <pic:cNvPr id="2" name=""/>
+                  <pic:cNvPicPr/>
+                </pic:nvPicPr>
+                <pic:blipFill>
+                  <a:blip r:embed="rId1">
+                    <a:extLst>
+                      <a:ext uri="{28A0092B-C50C-407E-A947-70E740481C1C}">
+                        <a14:useLocalDpi xmlns:a14="http://schemas.microsoft.com/office/drawing/2010/main" val="0"/>
+                      </a:ext>
+                    </a:extLst>
+                  </a:blip>
+                  <a:stretch>
+                    <a:fillRect/>
+                  </a:stretch>
+                </pic:blipFill>
+                <pic:spPr>
+                  <a:xfrm>
+                    <a:off x="0" y="0"/>
+                    <a:ext cx="7560000" cy="10692000"/>
+                  </a:xfrm>
+                  <a:prstGeom prst="rect">
+                    <a:avLst/>
+                  </a:prstGeom>
+                </pic:spPr>
+              </pic:pic>
+            </a:graphicData>
+          </a:graphic>
+          <wp14:sizeRelH relativeFrom="margin">
+            <wp14:pctWidth>0</wp14:pctWidth>
+          </wp14:sizeRelH>
+          <wp14:sizeRelV relativeFrom="margin">
+            <wp14:pctHeight>0</wp14:pctHeight>
+          </wp14:sizeRelV>
+        </wp:anchor>
+      </w:drawing>
+    </w:r>
+  </w:p>
+</w:hdr>
+</file>
+
+<file path=word/header3.xml><?xml version="1.0" encoding="utf-8"?>
+<w:hdr xmlns:wpc="http://schemas.microsoft.com/office/word/2010/wordprocessingCanvas" xmlns:cx="http://schemas.microsoft.com/office/drawing/2014/chartex" xmlns:cx1="http://schemas.microsoft.com/office/drawing/2015/9/8/chartex" xmlns:cx2="http://schemas.microsoft.com/office/drawing/2015/10/21/chartex" xmlns:cx3="http://schemas.microsoft.com/office/drawing/2016/5/9/chartex" xmlns:cx4="http://schemas.microsoft.com/office/drawing/2016/5/10/chartex" xmlns:cx5="http://schemas.microsoft.com/office/drawing/2016/5/11/chartex" xmlns:cx6="http://schemas.microsoft.com/office/drawing/2016/5/12/chartex" xmlns:cx7="http://schemas.microsoft.com/office/drawing/2016/5/13/chartex" xmlns:cx8="http://schemas.microsoft.com/office/drawing/2016/5/14/chartex" xmlns:mc="http://schemas.openxmlformats.org/markup-compatibility/2006" xmlns:aink="http://schemas.microsoft.com/office/drawing/2016/ink" xmlns:am3d="http://schemas.microsoft.com/office/drawing/2017/model3d" xmlns:o="urn:schemas-microsoft-com:office:office" xmlns:r="http://schemas.openxmlformats.org/officeDocument/2006/relationships" xmlns:m="http://schemas.openxmlformats.org/officeDocument/2006/math" xmlns:v="urn:schemas-microsoft-com:vml" xmlns:wp14="http://schemas.microsoft.com/office/word/2010/wordprocessingDrawing" xmlns:wp="http://schemas.openxmlformats.org/drawingml/2006/wordprocessingDrawing" xmlns:w10="urn:schemas-microsoft-com:office:word" xmlns:w="http://schemas.openxmlformats.org/wordprocessingml/2006/main" xmlns:w14="http://schemas.microsoft.com/office/word/2010/wordml" xmlns:w15="http://schemas.microsoft.com/office/word/2012/wordml" xmlns:w16cid="http://schemas.microsoft.com/office/word/2016/wordml/cid" xmlns:w16se="http://schemas.microsoft.com/office/word/2015/wordml/symex" xmlns:wpg="http://schemas.microsoft.com/office/word/2010/wordprocessingGroup" xmlns:wpi="http://schemas.microsoft.com/office/word/2010/wordprocessingInk" xmlns:wne="http://schemas.microsoft.com/office/word/2006/wordml" xmlns:wps="http://schemas.microsoft.com/office/word/2010/wordprocessingShape" mc:Ignorable="w14 w15 w16se w16cid wp14">
+  <w:p>
+    <w:pPr>
+      <w:pStyle w:val="Header"/>
     </w:pPr>
   </w:p>
 </w:hdr>

</xml_diff>